<commit_message>
Refonte Carrière : nav EXPÉRIENCE -> CARRIÈRE, parcours scolaire déplacé de Compétences, split Informatique/Restauration, ajout stages restauration (Lyna, Chamas Tacos, L'Alsacien) et CV informatique mis à jour avec le stage Bayard + CCNA
Co-Authored-By: Claude Sonnet 5 <noreply@anthropic.com>
</commit_message>
<xml_diff>
--- a/assets/docs/CV_Yuung_Kansietoko_Informatique.docx
+++ b/assets/docs/CV_Yuung_Kansietoko_Informatique.docx
@@ -99,13 +99,8 @@
               <w:t xml:space="preserve">   •   </w:t>
             </w:r>
             <w:r>
-              <w:t>linkedin.com/in/</w:t>
+              <w:t>linkedin.com/in/yuung-addi</w:t>
             </w:r>
-            <w:proofErr w:type="spellStart"/>
-            <w:r>
-              <w:t>yuung-addi</w:t>
-            </w:r>
-            <w:proofErr w:type="spellEnd"/>
           </w:p>
         </w:tc>
         <w:tc>
@@ -382,23 +377,7 @@
           <w:sz w:val="20"/>
           <w:szCs w:val="20"/>
         </w:rPr>
-        <w:t xml:space="preserve">Kali Linux, </w:t>
-      </w:r>
-      <w:proofErr w:type="spellStart"/>
-      <w:r>
-        <w:rPr>
-          <w:sz w:val="20"/>
-          <w:szCs w:val="20"/>
-        </w:rPr>
-        <w:t>Metasploit</w:t>
-      </w:r>
-      <w:proofErr w:type="spellEnd"/>
-      <w:r>
-        <w:rPr>
-          <w:sz w:val="20"/>
-          <w:szCs w:val="20"/>
-        </w:rPr>
-        <w:t>, Wireshark, IDS/IPS, Firewall, VPN, RGPD/CNIL</w:t>
+        <w:t xml:space="preserve">Kali Linux, Metasploit, Wireshark, IDS/IPS, Firewall, VPN, RGPD/CNIL</w:t>
       </w:r>
     </w:p>
     <w:p>
@@ -423,23 +402,7 @@
           <w:sz w:val="20"/>
           <w:szCs w:val="20"/>
         </w:rPr>
-        <w:t xml:space="preserve">TCP/IP, VLANs, OSPF, DHCP/DNS, Cisco </w:t>
-      </w:r>
-      <w:proofErr w:type="spellStart"/>
-      <w:r>
-        <w:rPr>
-          <w:sz w:val="20"/>
-          <w:szCs w:val="20"/>
-        </w:rPr>
-        <w:t>Packet</w:t>
-      </w:r>
-      <w:proofErr w:type="spellEnd"/>
-      <w:r>
-        <w:rPr>
-          <w:sz w:val="20"/>
-          <w:szCs w:val="20"/>
-        </w:rPr>
-        <w:t xml:space="preserve"> Tracer, Active Directory, GPO, Debian, Windows Server</w:t>
+        <w:t xml:space="preserve">TCP/IP, VLANs, OSPF, DHCP/DNS, Cisco Packet Tracer, Active Directory, GPO, Debian, Windows Server</w:t>
       </w:r>
     </w:p>
     <w:p>
@@ -464,23 +427,7 @@
           <w:sz w:val="20"/>
           <w:szCs w:val="20"/>
         </w:rPr>
-        <w:t xml:space="preserve">GLPI + </w:t>
-      </w:r>
-      <w:proofErr w:type="spellStart"/>
-      <w:r>
-        <w:rPr>
-          <w:sz w:val="20"/>
-          <w:szCs w:val="20"/>
-        </w:rPr>
-        <w:t>FusionInventory</w:t>
-      </w:r>
-      <w:proofErr w:type="spellEnd"/>
-      <w:r>
-        <w:rPr>
-          <w:sz w:val="20"/>
-          <w:szCs w:val="20"/>
-        </w:rPr>
-        <w:t>, LAMP stack, VMware/VirtualBox, Bash</w:t>
+        <w:t xml:space="preserve">GLPI + FusionInventory, LAMP stack, VMware/VirtualBox, Bash</w:t>
       </w:r>
     </w:p>
     <w:p>
@@ -530,23 +477,7 @@
           <w:sz w:val="20"/>
           <w:szCs w:val="20"/>
         </w:rPr>
-        <w:t xml:space="preserve">AWS Cloud </w:t>
-      </w:r>
-      <w:proofErr w:type="spellStart"/>
-      <w:r>
-        <w:rPr>
-          <w:sz w:val="20"/>
-          <w:szCs w:val="20"/>
-        </w:rPr>
-        <w:t>Foundations</w:t>
-      </w:r>
-      <w:proofErr w:type="spellEnd"/>
-      <w:r>
-        <w:rPr>
-          <w:sz w:val="20"/>
-          <w:szCs w:val="20"/>
-        </w:rPr>
-        <w:t xml:space="preserve"> · ANSSI · IA</w:t>
+        <w:t xml:space="preserve">AWS Cloud Foundations · ANSSI · IA · CCNA</w:t>
       </w:r>
     </w:p>
     <w:p>
@@ -582,16 +513,7 @@
           <w:sz w:val="20"/>
           <w:szCs w:val="20"/>
         </w:rPr>
-        <w:t xml:space="preserve">Apprenti Technicien </w:t>
-      </w:r>
-      <w:r>
-        <w:rPr>
-          <w:b/>
-          <w:bCs/>
-          <w:sz w:val="20"/>
-          <w:szCs w:val="20"/>
-        </w:rPr>
-        <w:t>Supérieur</w:t>
+        <w:t xml:space="preserve">Stagiaire Technicien en Cybersécurité</w:t>
       </w:r>
       <w:r>
         <w:rPr>
@@ -599,15 +521,7 @@
           <w:sz w:val="20"/>
           <w:szCs w:val="20"/>
         </w:rPr>
-        <w:t xml:space="preserve"> |</w:t>
-      </w:r>
-      <w:r>
-        <w:rPr>
-          <w:color w:val="999999"/>
-          <w:sz w:val="20"/>
-          <w:szCs w:val="20"/>
-        </w:rPr>
-        <w:t xml:space="preserve">  </w:t>
+        <w:t xml:space="preserve"> |  </w:t>
       </w:r>
       <w:r>
         <w:rPr>
@@ -616,7 +530,7 @@
           <w:sz w:val="20"/>
           <w:szCs w:val="20"/>
         </w:rPr>
-        <w:t>Kuba</w:t>
+        <w:t>Groupe Bayard</w:t>
       </w:r>
       <w:r>
         <w:rPr>
@@ -624,7 +538,7 @@
           <w:sz w:val="20"/>
           <w:szCs w:val="20"/>
         </w:rPr>
-        <w:t xml:space="preserve">  —  Besançon</w:t>
+        <w:t xml:space="preserve">  –  DSI</w:t>
       </w:r>
       <w:r>
         <w:rPr>
@@ -632,7 +546,7 @@
           <w:sz w:val="20"/>
           <w:szCs w:val="20"/>
         </w:rPr>
-        <w:t xml:space="preserve">    Oct. 2024 – Mars 2025</w:t>
+        <w:t xml:space="preserve">    15 Juin – 17 Juil. 2026</w:t>
       </w:r>
     </w:p>
     <w:p>
@@ -653,7 +567,58 @@
           <w:sz w:val="20"/>
           <w:szCs w:val="20"/>
         </w:rPr>
-        <w:t>Gestion des licences informatiques et des accès utilisateurs</w:t>
+        <w:t xml:space="preserve">Intégration à l’équipe Cybersécurité de la DSI du Groupe Bayard (5ème groupe de presse en France, plus de 200 sites web)</w:t>
+      </w:r>
+    </w:p>
+    <w:p>
+      <w:pPr>
+        <w:spacing w:before="100" w:after="30"/>
+        <w:rPr>
+          <w:sz w:val="20"/>
+          <w:szCs w:val="20"/>
+        </w:rPr>
+      </w:pPr>
+      <w:r>
+        <w:rPr>
+          <w:b/>
+          <w:bCs/>
+          <w:sz w:val="20"/>
+          <w:szCs w:val="20"/>
+        </w:rPr>
+        <w:t xml:space="preserve">Apprenti Technicien Supérieur</w:t>
+      </w:r>
+      <w:r>
+        <w:rPr>
+          <w:color w:val="999999"/>
+          <w:sz w:val="20"/>
+          <w:szCs w:val="20"/>
+        </w:rPr>
+        <w:t xml:space="preserve"> |  </w:t>
+      </w:r>
+      <w:r>
+        <w:rPr>
+          <w:i/>
+          <w:iCs/>
+          <w:sz w:val="20"/>
+          <w:szCs w:val="20"/>
+        </w:rPr>
+        <w:t>Kuba</w:t>
+      </w:r>
+      <w:r>
+        <w:rPr>
+          <w:color w:val="555555"/>
+          <w:sz w:val="20"/>
+          <w:szCs w:val="20"/>
+        </w:rPr>
+        <w:t xml:space="preserve">  —  Besançon</w:t>
+      </w:r>
+      <w:r>
+        <w:rPr>
+          <w:color w:val="777777"/>
+          <w:sz w:val="20"/>
+          <w:szCs w:val="20"/>
+        </w:rPr>
+        <w:t xml:space="preserve">    Oct. 2024 – Mars 2025</w:t>
       </w:r>
     </w:p>
     <w:p>
@@ -674,93 +639,7 @@
           <w:sz w:val="20"/>
           <w:szCs w:val="20"/>
         </w:rPr>
-        <w:t xml:space="preserve">Tests de logiciels sur interface utilisateur (UI </w:t>
-      </w:r>
-      <w:proofErr w:type="spellStart"/>
-      <w:r>
-        <w:rPr>
-          <w:sz w:val="20"/>
-          <w:szCs w:val="20"/>
-        </w:rPr>
-        <w:t>testing</w:t>
-      </w:r>
-      <w:proofErr w:type="spellEnd"/>
-      <w:r>
-        <w:rPr>
-          <w:sz w:val="20"/>
-          <w:szCs w:val="20"/>
-        </w:rPr>
-        <w:t>) et support technique interne</w:t>
-      </w:r>
-    </w:p>
-    <w:p>
-      <w:pPr>
-        <w:spacing w:before="100" w:after="30"/>
-        <w:rPr>
-          <w:sz w:val="20"/>
-          <w:szCs w:val="20"/>
-        </w:rPr>
-      </w:pPr>
-      <w:r>
-        <w:rPr>
-          <w:b/>
-          <w:bCs/>
-          <w:sz w:val="20"/>
-          <w:szCs w:val="20"/>
-        </w:rPr>
-        <w:t xml:space="preserve">Stagiaire Testeur d'applications </w:t>
-      </w:r>
-      <w:r>
-        <w:rPr>
-          <w:b/>
-          <w:bCs/>
-          <w:sz w:val="20"/>
-          <w:szCs w:val="20"/>
-        </w:rPr>
-        <w:t>UI</w:t>
-      </w:r>
-      <w:r>
-        <w:rPr>
-          <w:color w:val="999999"/>
-          <w:sz w:val="20"/>
-          <w:szCs w:val="20"/>
-        </w:rPr>
-        <w:t xml:space="preserve"> |</w:t>
-      </w:r>
-      <w:r>
-        <w:rPr>
-          <w:color w:val="999999"/>
-          <w:sz w:val="20"/>
-          <w:szCs w:val="20"/>
-        </w:rPr>
-        <w:t xml:space="preserve">  </w:t>
-      </w:r>
-      <w:proofErr w:type="spellStart"/>
-      <w:r>
-        <w:rPr>
-          <w:i/>
-          <w:iCs/>
-          <w:sz w:val="20"/>
-          <w:szCs w:val="20"/>
-        </w:rPr>
-        <w:t>Digimobee</w:t>
-      </w:r>
-      <w:proofErr w:type="spellEnd"/>
-      <w:r>
-        <w:rPr>
-          <w:color w:val="555555"/>
-          <w:sz w:val="20"/>
-          <w:szCs w:val="20"/>
-        </w:rPr>
-        <w:t xml:space="preserve">  —  Paris</w:t>
-      </w:r>
-      <w:r>
-        <w:rPr>
-          <w:color w:val="777777"/>
-          <w:sz w:val="20"/>
-          <w:szCs w:val="20"/>
-        </w:rPr>
-        <w:t xml:space="preserve">    Nov. 2023 – Jan. 2024</w:t>
+        <w:t>Gestion des licences informatiques et des accès utilisateurs</w:t>
       </w:r>
     </w:p>
     <w:p>
@@ -781,7 +660,58 @@
           <w:sz w:val="20"/>
           <w:szCs w:val="20"/>
         </w:rPr>
-        <w:t>Tests de conformité et non-régression sur l'appli Ligne d'Azur &amp; Wallet LAT</w:t>
+        <w:t xml:space="preserve">Tests de logiciels sur interface utilisateur (UI testing) et support technique interne</w:t>
+      </w:r>
+    </w:p>
+    <w:p>
+      <w:pPr>
+        <w:spacing w:before="100" w:after="30"/>
+        <w:rPr>
+          <w:sz w:val="20"/>
+          <w:szCs w:val="20"/>
+        </w:rPr>
+      </w:pPr>
+      <w:r>
+        <w:rPr>
+          <w:b/>
+          <w:bCs/>
+          <w:sz w:val="20"/>
+          <w:szCs w:val="20"/>
+        </w:rPr>
+        <w:t xml:space="preserve">Stagiaire Testeur d'applications UI</w:t>
+      </w:r>
+      <w:r>
+        <w:rPr>
+          <w:color w:val="999999"/>
+          <w:sz w:val="20"/>
+          <w:szCs w:val="20"/>
+        </w:rPr>
+        <w:t xml:space="preserve"> |  </w:t>
+      </w:r>
+      <w:r>
+        <w:rPr>
+          <w:i/>
+          <w:iCs/>
+          <w:sz w:val="20"/>
+          <w:szCs w:val="20"/>
+        </w:rPr>
+        <w:t>Digimobee</w:t>
+      </w:r>
+      <w:r>
+        <w:rPr>
+          <w:color w:val="555555"/>
+          <w:sz w:val="20"/>
+          <w:szCs w:val="20"/>
+        </w:rPr>
+        <w:t xml:space="preserve">  —  Paris</w:t>
+      </w:r>
+      <w:r>
+        <w:rPr>
+          <w:color w:val="777777"/>
+          <w:sz w:val="20"/>
+          <w:szCs w:val="20"/>
+        </w:rPr>
+        <w:t xml:space="preserve">    Nov. 2023 – Jan. 2024</w:t>
       </w:r>
     </w:p>
     <w:p>
@@ -797,72 +727,12 @@
           <w:szCs w:val="20"/>
         </w:rPr>
       </w:pPr>
-      <w:proofErr w:type="spellStart"/>
-      <w:r>
-        <w:rPr>
-          <w:sz w:val="20"/>
-          <w:szCs w:val="20"/>
-        </w:rPr>
-        <w:t>Reporting</w:t>
-      </w:r>
-      <w:proofErr w:type="spellEnd"/>
-      <w:r>
-        <w:rPr>
-          <w:sz w:val="20"/>
-          <w:szCs w:val="20"/>
-        </w:rPr>
-        <w:t xml:space="preserve"> des bugs sur Excel après campagnes de tests</w:t>
-      </w:r>
-    </w:p>
-    <w:p>
-      <w:pPr>
-        <w:spacing w:before="100" w:after="30"/>
-        <w:rPr>
-          <w:sz w:val="20"/>
-          <w:szCs w:val="20"/>
-        </w:rPr>
-      </w:pPr>
-      <w:r>
-        <w:rPr>
-          <w:b/>
-          <w:bCs/>
-          <w:sz w:val="20"/>
-          <w:szCs w:val="20"/>
-        </w:rPr>
-        <w:t>Assistant professeur informatique (stage)</w:t>
-      </w:r>
-      <w:r>
-        <w:rPr>
-          <w:color w:val="999999"/>
-          <w:sz w:val="20"/>
-          <w:szCs w:val="20"/>
-        </w:rPr>
-        <w:t xml:space="preserve">  |  </w:t>
-      </w:r>
-      <w:r>
-        <w:rPr>
-          <w:i/>
-          <w:iCs/>
-          <w:sz w:val="20"/>
-          <w:szCs w:val="20"/>
-        </w:rPr>
-        <w:t>Centre Social des Sablons</w:t>
-      </w:r>
-      <w:r>
-        <w:rPr>
-          <w:color w:val="555555"/>
-          <w:sz w:val="20"/>
-          <w:szCs w:val="20"/>
-        </w:rPr>
-        <w:t xml:space="preserve">  —  Sarcelles</w:t>
-      </w:r>
-      <w:r>
-        <w:rPr>
-          <w:color w:val="777777"/>
-          <w:sz w:val="20"/>
-          <w:szCs w:val="20"/>
-        </w:rPr>
-        <w:t xml:space="preserve">    Mai – Juin 2023</w:t>
+      <w:r>
+        <w:rPr>
+          <w:sz w:val="20"/>
+          <w:szCs w:val="20"/>
+        </w:rPr>
+        <w:t>Tests de conformité et non-régression sur l'appli Ligne d'Azur &amp; Wallet LAT</w:t>
       </w:r>
     </w:p>
     <w:p>
@@ -873,78 +743,35 @@
           <w:numId w:val="2"/>
         </w:numPr>
         <w:spacing w:before="25"/>
-      </w:pPr>
-      <w:r>
-        <w:rPr>
-          <w:sz w:val="20"/>
-          <w:szCs w:val="20"/>
-        </w:rPr>
-        <w:t>Animation de cours Pack Office et navigation internet, élaboration d'un plan de cours annuel</w:t>
-      </w:r>
-    </w:p>
-    <w:p>
-      <w:pPr>
-        <w:pBdr>
-          <w:bottom w:val="single" w:sz="8" w:space="3" w:color="22AA22"/>
-        </w:pBdr>
-        <w:spacing w:before="180" w:after="60"/>
+        <w:rPr>
+          <w:sz w:val="20"/>
+          <w:szCs w:val="20"/>
+        </w:rPr>
+      </w:pPr>
+      <w:r>
+        <w:rPr>
+          <w:sz w:val="20"/>
+          <w:szCs w:val="20"/>
+        </w:rPr>
+        <w:t xml:space="preserve">Reporting des bugs sur Excel après campagnes de tests</w:t>
+      </w:r>
+    </w:p>
+    <w:p>
+      <w:pPr>
+        <w:spacing w:before="100" w:after="30"/>
+        <w:rPr>
+          <w:sz w:val="20"/>
+          <w:szCs w:val="20"/>
+        </w:rPr>
       </w:pPr>
       <w:r>
         <w:rPr>
           <w:b/>
           <w:bCs/>
-          <w:color w:val="0D6B0D"/>
-          <w:sz w:val="22"/>
-          <w:szCs w:val="22"/>
-        </w:rPr>
-        <w:t>PROJETS &amp; RÉALISATIONS</w:t>
-      </w:r>
-    </w:p>
-    <w:p>
-      <w:pPr>
-        <w:spacing w:before="100" w:after="30"/>
-        <w:rPr>
-          <w:sz w:val="20"/>
-          <w:szCs w:val="20"/>
-        </w:rPr>
-      </w:pPr>
-      <w:r>
-        <w:rPr>
-          <w:b/>
-          <w:bCs/>
-          <w:sz w:val="20"/>
-          <w:szCs w:val="20"/>
-        </w:rPr>
-        <w:t xml:space="preserve">Projet </w:t>
-      </w:r>
-      <w:proofErr w:type="spellStart"/>
-      <w:r>
-        <w:rPr>
-          <w:b/>
-          <w:bCs/>
-          <w:sz w:val="20"/>
-          <w:szCs w:val="20"/>
-        </w:rPr>
-        <w:t>Madzi</w:t>
-      </w:r>
-      <w:proofErr w:type="spellEnd"/>
-      <w:r>
-        <w:rPr>
-          <w:b/>
-          <w:bCs/>
-          <w:sz w:val="20"/>
-          <w:szCs w:val="20"/>
-        </w:rPr>
-        <w:t xml:space="preserve"> — Infrastructure réseau </w:t>
-      </w:r>
-      <w:r>
-        <w:rPr>
-          <w:b/>
-          <w:bCs/>
-          <w:sz w:val="20"/>
-          <w:szCs w:val="20"/>
-        </w:rPr>
-        <w:t>Cisco</w:t>
+          <w:sz w:val="20"/>
+          <w:szCs w:val="20"/>
+        </w:rPr>
+        <w:t>Assistant professeur informatique (stage)</w:t>
       </w:r>
       <w:r>
         <w:rPr>
@@ -952,15 +779,7 @@
           <w:sz w:val="20"/>
           <w:szCs w:val="20"/>
         </w:rPr>
-        <w:t xml:space="preserve"> |</w:t>
-      </w:r>
-      <w:r>
-        <w:rPr>
-          <w:color w:val="999999"/>
-          <w:sz w:val="20"/>
-          <w:szCs w:val="20"/>
-        </w:rPr>
-        <w:t xml:space="preserve">  </w:t>
+        <w:t xml:space="preserve">  |  </w:t>
       </w:r>
       <w:r>
         <w:rPr>
@@ -969,7 +788,7 @@
           <w:sz w:val="20"/>
           <w:szCs w:val="20"/>
         </w:rPr>
-        <w:t>BTS SIO</w:t>
+        <w:t>Centre Social des Sablons</w:t>
       </w:r>
       <w:r>
         <w:rPr>
@@ -977,25 +796,7 @@
           <w:sz w:val="20"/>
           <w:szCs w:val="20"/>
         </w:rPr>
-        <w:t xml:space="preserve">  —  </w:t>
-      </w:r>
-      <w:proofErr w:type="spellStart"/>
-      <w:r>
-        <w:rPr>
-          <w:color w:val="555555"/>
-          <w:sz w:val="20"/>
-          <w:szCs w:val="20"/>
-        </w:rPr>
-        <w:t>Packet</w:t>
-      </w:r>
-      <w:proofErr w:type="spellEnd"/>
-      <w:r>
-        <w:rPr>
-          <w:color w:val="555555"/>
-          <w:sz w:val="20"/>
-          <w:szCs w:val="20"/>
-        </w:rPr>
-        <w:t xml:space="preserve"> Tracer</w:t>
+        <w:t xml:space="preserve">  —  Sarcelles</w:t>
       </w:r>
       <w:r>
         <w:rPr>
@@ -1003,7 +804,7 @@
           <w:sz w:val="20"/>
           <w:szCs w:val="20"/>
         </w:rPr>
-        <w:t xml:space="preserve">    2025</w:t>
+        <w:t xml:space="preserve">    Mai – Juin 2023</w:t>
       </w:r>
     </w:p>
     <w:p>
@@ -1014,36 +815,41 @@
           <w:numId w:val="2"/>
         </w:numPr>
         <w:spacing w:before="25"/>
-        <w:rPr>
-          <w:sz w:val="20"/>
-          <w:szCs w:val="20"/>
-        </w:rPr>
-      </w:pPr>
-      <w:r>
-        <w:rPr>
-          <w:sz w:val="20"/>
-          <w:szCs w:val="20"/>
-        </w:rPr>
-        <w:t>VLANs, routage inter-VLAN, protocole OSPF, services DHCP/DNS sur équipements Cisco</w:t>
-      </w:r>
-    </w:p>
-    <w:p>
-      <w:pPr>
-        <w:spacing w:before="100" w:after="30"/>
-        <w:rPr>
-          <w:sz w:val="20"/>
-          <w:szCs w:val="20"/>
-        </w:rPr>
+      </w:pPr>
+      <w:r>
+        <w:rPr>
+          <w:sz w:val="20"/>
+          <w:szCs w:val="20"/>
+        </w:rPr>
+        <w:t>Animation de cours Pack Office et navigation internet, élaboration d'un plan de cours annuel</w:t>
+      </w:r>
+    </w:p>
+    <w:p>
+      <w:pPr>
+        <w:pBdr>
+          <w:bottom w:val="single" w:sz="8" w:space="3" w:color="22AA22"/>
+        </w:pBdr>
+        <w:spacing w:before="180" w:after="60"/>
       </w:pPr>
       <w:r>
         <w:rPr>
           <w:b/>
           <w:bCs/>
-          <w:sz w:val="20"/>
-          <w:szCs w:val="20"/>
-        </w:rPr>
-        <w:t xml:space="preserve">Projet Mallet — Windows Server 2025 + Active </w:t>
-      </w:r>
+          <w:color w:val="0D6B0D"/>
+          <w:sz w:val="22"/>
+          <w:szCs w:val="22"/>
+        </w:rPr>
+        <w:t>PROJETS &amp; RÉALISATIONS</w:t>
+      </w:r>
+    </w:p>
+    <w:p>
+      <w:pPr>
+        <w:spacing w:before="100" w:after="30"/>
+        <w:rPr>
+          <w:sz w:val="20"/>
+          <w:szCs w:val="20"/>
+        </w:rPr>
+      </w:pPr>
       <w:r>
         <w:rPr>
           <w:b/>
@@ -1051,7 +857,7 @@
           <w:sz w:val="20"/>
           <w:szCs w:val="20"/>
         </w:rPr>
-        <w:t>Directory</w:t>
+        <w:t xml:space="preserve">Projet Madzi — Infrastructure réseau Cisco</w:t>
       </w:r>
       <w:r>
         <w:rPr>
@@ -1059,15 +865,7 @@
           <w:sz w:val="20"/>
           <w:szCs w:val="20"/>
         </w:rPr>
-        <w:t xml:space="preserve"> |</w:t>
-      </w:r>
-      <w:r>
-        <w:rPr>
-          <w:color w:val="999999"/>
-          <w:sz w:val="20"/>
-          <w:szCs w:val="20"/>
-        </w:rPr>
-        <w:t xml:space="preserve">  </w:t>
+        <w:t xml:space="preserve"> |  </w:t>
       </w:r>
       <w:r>
         <w:rPr>
@@ -1084,7 +882,7 @@
           <w:sz w:val="20"/>
           <w:szCs w:val="20"/>
         </w:rPr>
-        <w:t xml:space="preserve">  —  AD / GPO</w:t>
+        <w:t xml:space="preserve">  —  Packet Tracer</w:t>
       </w:r>
       <w:r>
         <w:rPr>
@@ -1113,23 +911,7 @@
           <w:sz w:val="20"/>
           <w:szCs w:val="20"/>
         </w:rPr>
-        <w:t xml:space="preserve">Déploiement AD, 3 </w:t>
-      </w:r>
-      <w:proofErr w:type="spellStart"/>
-      <w:r>
-        <w:rPr>
-          <w:sz w:val="20"/>
-          <w:szCs w:val="20"/>
-        </w:rPr>
-        <w:t>OUs</w:t>
-      </w:r>
-      <w:proofErr w:type="spellEnd"/>
-      <w:r>
-        <w:rPr>
-          <w:sz w:val="20"/>
-          <w:szCs w:val="20"/>
-        </w:rPr>
-        <w:t>, GPO pour la Fondation Mallet (11 établissements, Yvelines) + intégration GLPI</w:t>
+        <w:t>VLANs, routage inter-VLAN, protocole OSPF, services DHCP/DNS sur équipements Cisco</w:t>
       </w:r>
     </w:p>
     <w:p>
@@ -1147,7 +929,7 @@
           <w:sz w:val="20"/>
           <w:szCs w:val="20"/>
         </w:rPr>
-        <w:t>Projet Mairie de Versailles — Déploiement GLPI</w:t>
+        <w:t xml:space="preserve">Projet Mallet — Windows Server 2025 + Active Directory</w:t>
       </w:r>
       <w:r>
         <w:rPr>
@@ -1155,7 +937,7 @@
           <w:sz w:val="20"/>
           <w:szCs w:val="20"/>
         </w:rPr>
-        <w:t xml:space="preserve">  |  </w:t>
+        <w:t xml:space="preserve"> |  </w:t>
       </w:r>
       <w:r>
         <w:rPr>
@@ -1172,7 +954,7 @@
           <w:sz w:val="20"/>
           <w:szCs w:val="20"/>
         </w:rPr>
-        <w:t xml:space="preserve">  —  Debian 13 / LAMP</w:t>
+        <w:t xml:space="preserve">  —  AD / GPO</w:t>
       </w:r>
       <w:r>
         <w:rPr>
@@ -1201,23 +983,7 @@
           <w:sz w:val="20"/>
           <w:szCs w:val="20"/>
         </w:rPr>
-        <w:t xml:space="preserve">Stack LAMP sur Debian 13, GLPI + </w:t>
-      </w:r>
-      <w:proofErr w:type="spellStart"/>
-      <w:r>
-        <w:rPr>
-          <w:sz w:val="20"/>
-          <w:szCs w:val="20"/>
-        </w:rPr>
-        <w:t>FusionInventory</w:t>
-      </w:r>
-      <w:proofErr w:type="spellEnd"/>
-      <w:r>
-        <w:rPr>
-          <w:sz w:val="20"/>
-          <w:szCs w:val="20"/>
-        </w:rPr>
-        <w:t>, configuration SLA / TTO / TTR</w:t>
+        <w:t xml:space="preserve">Déploiement AD, 3 OUs, GPO pour la Fondation Mallet (11 établissements, Yvelines) + intégration GLPI</w:t>
       </w:r>
     </w:p>
     <w:p>
@@ -1235,7 +1001,7 @@
           <w:sz w:val="20"/>
           <w:szCs w:val="20"/>
         </w:rPr>
-        <w:t>Portfolio BTS SIO</w:t>
+        <w:t>Projet Mairie de Versailles — Déploiement GLPI</w:t>
       </w:r>
       <w:r>
         <w:rPr>
@@ -1252,7 +1018,7 @@
           <w:sz w:val="20"/>
           <w:szCs w:val="20"/>
         </w:rPr>
-        <w:t>Projet personnel</w:t>
+        <w:t>BTS SIO</w:t>
       </w:r>
       <w:r>
         <w:rPr>
@@ -1260,7 +1026,7 @@
           <w:sz w:val="20"/>
           <w:szCs w:val="20"/>
         </w:rPr>
-        <w:t xml:space="preserve">  —  GitHub Pages</w:t>
+        <w:t xml:space="preserve">  —  Debian 13 / LAMP</w:t>
       </w:r>
       <w:r>
         <w:rPr>
@@ -1279,6 +1045,78 @@
           <w:numId w:val="2"/>
         </w:numPr>
         <w:spacing w:before="25"/>
+        <w:rPr>
+          <w:sz w:val="20"/>
+          <w:szCs w:val="20"/>
+        </w:rPr>
+      </w:pPr>
+      <w:r>
+        <w:rPr>
+          <w:sz w:val="20"/>
+          <w:szCs w:val="20"/>
+        </w:rPr>
+        <w:t xml:space="preserve">Stack LAMP sur Debian 13, GLPI + FusionInventory, configuration SLA / TTO / TTR</w:t>
+      </w:r>
+    </w:p>
+    <w:p>
+      <w:pPr>
+        <w:spacing w:before="100" w:after="30"/>
+        <w:rPr>
+          <w:sz w:val="20"/>
+          <w:szCs w:val="20"/>
+        </w:rPr>
+      </w:pPr>
+      <w:r>
+        <w:rPr>
+          <w:b/>
+          <w:bCs/>
+          <w:sz w:val="20"/>
+          <w:szCs w:val="20"/>
+        </w:rPr>
+        <w:t>Portfolio BTS SIO</w:t>
+      </w:r>
+      <w:r>
+        <w:rPr>
+          <w:color w:val="999999"/>
+          <w:sz w:val="20"/>
+          <w:szCs w:val="20"/>
+        </w:rPr>
+        <w:t xml:space="preserve">  |  </w:t>
+      </w:r>
+      <w:r>
+        <w:rPr>
+          <w:i/>
+          <w:iCs/>
+          <w:sz w:val="20"/>
+          <w:szCs w:val="20"/>
+        </w:rPr>
+        <w:t>Projet personnel</w:t>
+      </w:r>
+      <w:r>
+        <w:rPr>
+          <w:color w:val="555555"/>
+          <w:sz w:val="20"/>
+          <w:szCs w:val="20"/>
+        </w:rPr>
+        <w:t xml:space="preserve">  —  GitHub Pages</w:t>
+      </w:r>
+      <w:r>
+        <w:rPr>
+          <w:color w:val="777777"/>
+          <w:sz w:val="20"/>
+          <w:szCs w:val="20"/>
+        </w:rPr>
+        <w:t xml:space="preserve">    2025</w:t>
+      </w:r>
+    </w:p>
+    <w:p>
+      <w:pPr>
+        <w:pStyle w:val="Paragraphedeliste"/>
+        <w:numPr>
+          <w:ilvl w:val="0"/>
+          <w:numId w:val="2"/>
+        </w:numPr>
+        <w:spacing w:before="25"/>
       </w:pPr>
       <w:r>
         <w:rPr>
@@ -1338,19 +1176,8 @@
           <w:sz w:val="20"/>
           <w:szCs w:val="20"/>
         </w:rPr>
-        <w:t xml:space="preserve">Lycée </w:t>
-      </w:r>
-      <w:proofErr w:type="spellStart"/>
-      <w:r>
-        <w:rPr>
-          <w:i/>
-          <w:iCs/>
-          <w:sz w:val="20"/>
-          <w:szCs w:val="20"/>
-        </w:rPr>
-        <w:t>Latournelle</w:t>
-      </w:r>
-      <w:proofErr w:type="spellEnd"/>
+        <w:t xml:space="preserve">Lycée Latournelle</w:t>
+      </w:r>
       <w:r>
         <w:rPr>
           <w:color w:val="555555"/>

</xml_diff>